<commit_message>
jd(head-fcc): v2 — crypto T0 gate + multi-jurisdiction scope + corridor partners; careers/STUDY competitor trust-roles (Elliptic 25/TRM 111 boards fetched 15-Oct; Chainalysis NOT FETCHED)
</commit_message>
<xml_diff>
--- a/careers/JD-head-fcc.docx
+++ b/careers/JD-head-fcc.docx
@@ -4,84 +4,48 @@
   <w:body>
     <w:p>
       <w:pPr>
-        <w:pStyle w:val="Heading1"/>
+        <w:pStyle w:val="Title"/>
       </w:pPr>
       <w:r>
-        <w:rPr>
-          <w:color w:val="0B2D5C"/>
-        </w:rPr>
         <w:t>Head of Financial Crime Compliance — ChainSentry</w:t>
       </w:r>
     </w:p>
     <w:p>
       <w:r>
         <w:rPr>
-          <w:b w:val="0"/>
-          <w:i w:val="0"/>
-          <w:color w:val="555B66"/>
+          <w:color w:val="555F6B"/>
         </w:rPr>
-        <w:t>Aras Integrasi Sdn Bhd · ChainSentry (blockchain forensics, sovereign-deployable) · KL/hybrid · FT or Senior Advisor retainer</w:t>
+        <w:t>Aras Integrasi Sdn Bhd · v2 · 15-Oct-2026 · KL/hybrid · full-time or advisor retainer</w:t>
       </w:r>
     </w:p>
     <w:p>
       <w:r>
         <w:rPr>
-          <w:b w:val="0"/>
-          <w:i w:val="0"/>
-          <w:color w:val="555B66"/>
+          <w:i/>
+          <w:sz w:val="19"/>
         </w:rPr>
-        <w:t>v1 · 15-Oct-2026 · owner: Hadri</w:t>
+        <w:t>v2: crypto-competence ramp (T0 gate) + multi-jurisdiction scope + corridor design partners — engineered against live competitor hiring data (Elliptic/TRM, studied 15-Oct).</w:t>
       </w:r>
     </w:p>
     <w:p>
       <w:pPr>
-        <w:pStyle w:val="Heading2"/>
+        <w:pStyle w:val="Heading1"/>
       </w:pPr>
       <w:r>
-        <w:rPr>
-          <w:color w:val="0B2D5C"/>
-        </w:rPr>
-        <w:t>Why this role exists</w:t>
-      </w:r>
-    </w:p>
-    <w:p>
-      <w:r>
-        <w:rPr>
-          <w:b w:val="0"/>
-          <w:i w:val="0"/>
-        </w:rPr>
-        <w:t>ChainSentry's engineering is real; its trust is not yet built. Buyers of forensics are MLROs, CCOs and FIU officers who only trust vendors whose methodology survives a BNM examination, whose case files survive a court challenge, and whose salesperson has personally filed the STR they're now being examined for. This role owns ChainSentry's compliance credibility end-to-end — product requirements, evidentiary standard, regulator engagement, design-partner trust.</w:t>
-      </w:r>
-    </w:p>
-    <w:p>
-      <w:pPr>
-        <w:pStyle w:val="Heading2"/>
-      </w:pPr>
-      <w:r>
-        <w:rPr>
-          <w:color w:val="0B2D5C"/>
-        </w:rPr>
         <w:t>Mission</w:t>
       </w:r>
     </w:p>
     <w:p>
       <w:r>
-        <w:rPr>
-          <w:b/>
-          <w:i w:val="0"/>
-        </w:rPr>
-        <w:t>Make ChainSentry the blockchain-tracing product a Malaysian bank, DAX or FIU can defend choosing — to their board, to BNM/SC, and in court.</w:t>
+        <w:t>Make ChainSentry the blockchain-tracing product that a regulated institution — a Malaysian bank, DAX or FIU first, then any corridor jurisdiction (SG/TH/VN/ID/AE/TR/EG) — can defend choosing: to its board, to its regulator, and in court.</w:t>
       </w:r>
     </w:p>
     <w:p>
       <w:pPr>
-        <w:pStyle w:val="Heading2"/>
+        <w:pStyle w:val="Heading1"/>
       </w:pPr>
       <w:r>
-        <w:rPr>
-          <w:color w:val="0B2D5C"/>
-        </w:rPr>
-        <w:t>What he owns — five pillars</w:t>
+        <w:t>What he owns</w:t>
       </w:r>
     </w:p>
     <w:tbl>
@@ -103,6 +67,9 @@
           </w:tcPr>
           <w:p>
             <w:r>
+              <w:rPr>
+                <w:b/>
+              </w:rPr>
               <w:t>Pillar</w:t>
             </w:r>
           </w:p>
@@ -113,6 +80,9 @@
           </w:tcPr>
           <w:p>
             <w:r>
+              <w:rPr>
+                <w:b/>
+              </w:rPr>
               <w:t>Scope</w:t>
             </w:r>
           </w:p>
@@ -123,6 +93,9 @@
           </w:tcPr>
           <w:p>
             <w:r>
+              <w:rPr>
+                <w:b/>
+              </w:rPr>
               <w:t>Authority</w:t>
             </w:r>
           </w:p>
@@ -135,7 +108,10 @@
           </w:tcPr>
           <w:p>
             <w:r>
-              <w:t>P1 Regulatory requirements → product</w:t>
+              <w:rPr>
+                <w:sz w:val="18"/>
+              </w:rPr>
+              <w:t>P1 Regulatory → product (multi-juris)</w:t>
             </w:r>
           </w:p>
         </w:tc>
@@ -145,7 +121,10 @@
           </w:tcPr>
           <w:p>
             <w:r>
-              <w:t>Map BNM AML/CFT Policy, SC RM Guidelines 2025, PMABA, AMLATFPUAA 2001, FATF Rec. 15/R.20 to concrete features; own requirements spec to engineering</w:t>
+              <w:rPr>
+                <w:sz w:val="18"/>
+              </w:rPr>
+              <w:t>MY beachhead: BNM AML/CFT, SC RM Guidelines 2025, PMABA, AMLATFPUAA. Corridor: FATF R.15/R.20+Travel Rule, MAS PSN01/02 (SG), VARA/AMLC (UAE), AMLO (TH), PPATK (ID), MiCA horizon. Standing horizon-scan practice.</w:t>
             </w:r>
           </w:p>
         </w:tc>
@@ -155,7 +134,10 @@
           </w:tcPr>
           <w:p>
             <w:r>
-              <w:t>Sets trust-feature backlog priorities</w:t>
+              <w:rPr>
+                <w:sz w:val="18"/>
+              </w:rPr>
+              <w:t>Sets trust-backlog priorities</w:t>
             </w:r>
           </w:p>
         </w:tc>
@@ -167,6 +149,9 @@
           </w:tcPr>
           <w:p>
             <w:r>
+              <w:rPr>
+                <w:sz w:val="18"/>
+              </w:rPr>
               <w:t>P2 Evidentiary standard</w:t>
             </w:r>
           </w:p>
@@ -177,7 +162,10 @@
           </w:tcPr>
           <w:p>
             <w:r>
-              <w:t>Own chain-of-custody + court-grade export; validate tracing outputs stand as evidence</w:t>
+              <w:rPr>
+                <w:sz w:val="18"/>
+              </w:rPr>
+              <w:t>Chain-of-custody + court-grade export: TXID verification, STR field-mapping (FIED first, corridor FIUs next), order-response packs. Defines "good enough for the judge" incl. chain evidence.</w:t>
             </w:r>
           </w:p>
         </w:tc>
@@ -187,7 +175,10 @@
           </w:tcPr>
           <w:p>
             <w:r>
-              <w:t>VETO on any evidentiary claim</w:t>
+              <w:rPr>
+                <w:sz w:val="18"/>
+              </w:rPr>
+              <w:t>VETO on evidentiary claims</w:t>
             </w:r>
           </w:p>
         </w:tc>
@@ -199,6 +190,9 @@
           </w:tcPr>
           <w:p>
             <w:r>
+              <w:rPr>
+                <w:sz w:val="18"/>
+              </w:rPr>
               <w:t>P3 Trust gatekeeper</w:t>
             </w:r>
           </w:p>
@@ -209,7 +203,10 @@
           </w:tcPr>
           <w:p>
             <w:r>
-              <w:t>Review every sales claim/deck/webinar vs what the product can do and compliance can lawfully assert</w:t>
+              <w:rPr>
+                <w:sz w:val="18"/>
+              </w:rPr>
+              <w:t>Every sales claim, deck, webinar reviewed per jurisdiction against product truth and lawful assertion.</w:t>
             </w:r>
           </w:p>
         </w:tc>
@@ -219,6 +216,9 @@
           </w:tcPr>
           <w:p>
             <w:r>
+              <w:rPr>
+                <w:sz w:val="18"/>
+              </w:rPr>
               <w:t>VETO on claims</w:t>
             </w:r>
           </w:p>
@@ -231,7 +231,10 @@
           </w:tcPr>
           <w:p>
             <w:r>
-              <w:t>P4 Design-partner program</w:t>
+              <w:rPr>
+                <w:sz w:val="18"/>
+              </w:rPr>
+              <w:t>P4 Design partners (MY → corridor)</w:t>
             </w:r>
           </w:p>
         </w:tc>
@@ -241,7 +244,10 @@
           </w:tcPr>
           <w:p>
             <w:r>
-              <w:t>Recruit 2–3 design partners (his network + roster T1s); pilot-compliance playbook; convert to named references</w:t>
+              <w:rPr>
+                <w:sz w:val="18"/>
+              </w:rPr>
+              <w:t>2–3 MY partners (T1 roster + his network), then 1–2 corridor (MEA roster 72 targets). Pilot-compliance playbook → named references. Network-activation mandate, no cold quota.</w:t>
             </w:r>
           </w:p>
         </w:tc>
@@ -251,7 +257,10 @@
           </w:tcPr>
           <w:p>
             <w:r>
-              <w:t>Owns the design-partner bar</w:t>
+              <w:rPr>
+                <w:sz w:val="18"/>
+              </w:rPr>
+              <w:t>Owns partner bar (w/ Aras sales)</w:t>
             </w:r>
           </w:p>
         </w:tc>
@@ -263,7 +272,10 @@
           </w:tcPr>
           <w:p>
             <w:r>
-              <w:t>P5 Regulator &amp; industry presence</w:t>
+              <w:rPr>
+                <w:sz w:val="18"/>
+              </w:rPr>
+              <w:t>P5 Regulator &amp; industry (regional)</w:t>
             </w:r>
           </w:p>
         </w:tc>
@@ -273,7 +285,10 @@
           </w:tcPr>
           <w:p>
             <w:r>
-              <w:t>AMLCFA/conference circuit; methodology whitepaper under his name; BNM/SC channel as compliance peer</w:t>
+              <w:rPr>
+                <w:sz w:val="18"/>
+              </w:rPr>
+              <w:t>BNM/SC engagement as compliance peer; whitepaper multi-jurisdiction editions under his name; appearances beyond MY as corridor pilots engage.</w:t>
             </w:r>
           </w:p>
         </w:tc>
@@ -283,7 +298,10 @@
           </w:tcPr>
           <w:p>
             <w:r>
-              <w:t>ChainSentry's compliance voice</w:t>
+              <w:rPr>
+                <w:sz w:val="18"/>
+              </w:rPr>
+              <w:t>ChainSentry compliance voice</w:t>
             </w:r>
           </w:p>
         </w:tc>
@@ -291,181 +309,77 @@
     </w:tbl>
     <w:p>
       <w:pPr>
-        <w:pStyle w:val="Heading2"/>
+        <w:pStyle w:val="Heading1"/>
       </w:pPr>
       <w:r>
-        <w:rPr>
-          <w:color w:val="0B2D5C"/>
-        </w:rPr>
-        <w:t>Engineered success — measured, timeboxed</w:t>
-      </w:r>
-    </w:p>
-    <w:p>
-      <w:r>
-        <w:rPr>
-          <w:b w:val="0"/>
-          <w:i w:val="0"/>
-        </w:rPr>
-        <w:t>Day 0–30: Trust Requirements Spec v1 (every MLRO-testable obligation mapped to shipped/roadmap/gap, signed by COO); claims audit of all collateral, corrections applied.</w:t>
-      </w:r>
-    </w:p>
-    <w:p>
-      <w:r>
-        <w:rPr>
-          <w:b w:val="0"/>
-          <w:i w:val="0"/>
-        </w:rPr>
-        <w:t>Day 31–90: STR-ready case-file workflow validated — ChainSentry export → FIED STR field mapping + AMLATFPUAA §28 order-response pack; 2 design-partner workshops, ≥3 partners engaged.</w:t>
-      </w:r>
-    </w:p>
-    <w:p>
-      <w:r>
-        <w:rPr>
-          <w:b w:val="0"/>
-          <w:i w:val="0"/>
-        </w:rPr>
-        <w:t>Month 4–12: 2 pilots with named-reference rights; whitepaper published; ≥2 conference stages; ≥1 documented BNM/SC engagement. Success = a procurement checklist item where we answer a regulator question better than the incumbent foreign suite.</w:t>
-      </w:r>
-    </w:p>
-    <w:p>
-      <w:pPr>
-        <w:pStyle w:val="Heading2"/>
-      </w:pPr>
-      <w:r>
-        <w:rPr>
-          <w:color w:val="0B2D5C"/>
-        </w:rPr>
-        <w:t>The fit we are hiring for</w:t>
-      </w:r>
-    </w:p>
-    <w:p>
-      <w:r>
-        <w:rPr>
-          <w:b w:val="0"/>
-          <w:i w:val="0"/>
-        </w:rPr>
-        <w:t>10+ yrs AML/CFT: development bank / takaful / retail bank / unit trust. Current Manager, Financial Intelligence &amp; Integrity, Bank Pembangunan Malaysia — board-level AML advisory, IRA lead, CRP template build, core-banking implementation, FIED STR submission, AMLATFPUAA 2001 order response, court proceedings. Earlier Bank Rakyat surveillance officer (STR/CTR, branch assessment, LEA liaison); Hong Leong MSIG Takaful governance. CAMCO (AICB), ICA Cert KYC &amp; CDD. Tools: Refinitiv World-Check, Dow Jones, CTOS ConneX, ComplianceLink. He has sat in every chair ChainSentry sells to.</w:t>
-      </w:r>
-    </w:p>
-    <w:p>
-      <w:pPr>
-        <w:pStyle w:val="Heading2"/>
-      </w:pPr>
-      <w:r>
-        <w:rPr>
-          <w:color w:val="0B2D5C"/>
-        </w:rPr>
-        <w:t>What success needs from us</w:t>
+        <w:t>Engineered success (timeboxed artifacts)</w:t>
       </w:r>
     </w:p>
     <w:p>
       <w:pPr>
         <w:pStyle w:val="ListBullet"/>
+        <w:spacing w:after="80"/>
       </w:pPr>
       <w:r>
-        <w:t>Trust-feature backlog honored (6-week cycle on gap items)</w:t>
+        <w:t>Day 0–30 — T0 Chain-fluency boot: trace 5 live cases; day-30 gate = briefs one VA off-ramp typology unscripted. T1 Trust Requirements Spec v1 (MY + first corridor jurisdiction) signed by COO. T2 claims audit of all collateral.</w:t>
       </w:r>
     </w:p>
     <w:p>
       <w:pPr>
         <w:pStyle w:val="ListBullet"/>
+        <w:spacing w:after="80"/>
       </w:pPr>
       <w:r>
-        <w:t>Product sandbox + live-chain case work from week 1</w:t>
+        <w:t>Day 31–90 — T3 STR-ready case-file workflow (FIED mapping + AMLATFPUAA §28 pack) incl. crypto templates: exchange off-ramp, mixer-touch, mule fan-out. T4 two MY design-partner workshops, ≥3 engaged; first corridor partner opened.</w:t>
       </w:r>
     </w:p>
     <w:p>
       <w:pPr>
         <w:pStyle w:val="ListBullet"/>
+        <w:spacing w:after="80"/>
       </w:pPr>
       <w:r>
-        <w:t>Roster T1 warm doors handed with context (sales pairing: Shuhada/Jasila)</w:t>
+        <w:t>Month 4–12 — 2 MY pilots w/ named-reference rights + ≥1 corridor pilot. Whitepaper (MY v1 + corridor supplement). ≥2 stage appearances (≥1 outside MY). ≥1 documented BNM/SC engagement.</w:t>
       </w:r>
     </w:p>
     <w:p>
       <w:pPr>
         <w:pStyle w:val="ListBullet"/>
+        <w:spacing w:after="80"/>
       </w:pPr>
       <w:r>
-        <w:t>Conference + whitepaper budget line</w:t>
+        <w:t>Terminal metric — a procurement checklist item where ChainSentry answers a regulator question better than the incumbent foreign suite — and the same answer travels to the next jurisdiction.</w:t>
       </w:r>
     </w:p>
     <w:p>
       <w:pPr>
-        <w:pStyle w:val="ListBullet"/>
+        <w:pStyle w:val="Heading1"/>
       </w:pPr>
       <w:r>
-        <w:t>Harvey SDR owns top-of-funnel — he works warm doors and trust only</w:t>
+        <w:t>Crypto question, answered honestly</w:t>
+      </w:r>
+    </w:p>
+    <w:p>
+      <w:r>
+        <w:t>His resume shows zero crypto/VA exposure — stated, not hidden. Category norm: Elliptic requires only "working knowledge of crypto and blockchain" for its trust/advisory seats; chain depth lives in a separate investigator bench (ours = engineering + intelligence lane). The JD engineers closure via the T0 gate with a hard day-30 test. His transferables are what buyers test on: sanctions screening (UN/OFAC/MOHA), STR craft, order response, court testimony.</w:t>
       </w:r>
     </w:p>
     <w:p>
       <w:pPr>
-        <w:pStyle w:val="Heading2"/>
+        <w:pStyle w:val="Heading1"/>
       </w:pPr>
       <w:r>
-        <w:rPr>
-          <w:color w:val="0B2D5C"/>
-        </w:rPr>
-        <w:t>Guardrails</w:t>
+        <w:t>Engagement</w:t>
       </w:r>
     </w:p>
     <w:p>
       <w:r>
-        <w:rPr>
-          <w:b w:val="0"/>
-          <w:i w:val="0"/>
-        </w:rPr>
-        <w:t>While employed elsewhere: no solicitation of current employer; COO-disclosed independence note. No personal sales quota in year 1 — trust-building untaxed by commission; his bonus keys to the success KPIs above.</w:t>
-      </w:r>
-    </w:p>
-    <w:p>
-      <w:pPr>
-        <w:pStyle w:val="Heading2"/>
-      </w:pPr>
-      <w:r>
-        <w:rPr>
-          <w:color w:val="0B2D5C"/>
-        </w:rPr>
-        <w:t>Engagement options</w:t>
+        <w:t>A) Full-time — when off current employment; band indicative RM15–20k/mo + KPI bonus (owner to confirm).</w:t>
       </w:r>
     </w:p>
     <w:p>
       <w:r>
-        <w:rPr>
-          <w:b w:val="0"/>
-          <w:i w:val="0"/>
-        </w:rPr>
-        <w:t>A) Full-time Head of FCC — recommended post-transition; indicative band RM15–20k/mo + KPI bonus (owner to confirm).</w:t>
-      </w:r>
-    </w:p>
-    <w:p>
-      <w:r>
-        <w:rPr>
-          <w:b w:val="0"/>
-          <w:i w:val="0"/>
-        </w:rPr>
-        <w:t>B) Senior Advisor retainer, 2 days/wk: P1–P3 immediately, P4–P5 after transition; COI-clean with independence note.</w:t>
-      </w:r>
-    </w:p>
-    <w:p>
-      <w:pPr>
-        <w:pStyle w:val="Heading2"/>
-      </w:pPr>
-      <w:r>
-        <w:rPr>
-          <w:color w:val="0B2D5C"/>
-        </w:rPr>
-        <w:t>Verification state</w:t>
-      </w:r>
-    </w:p>
-    <w:p>
-      <w:r>
-        <w:rPr>
-          <w:b w:val="0"/>
-          <w:i/>
-          <w:color w:val="555B66"/>
-        </w:rPr>
-        <w:t>Fit statement sourced from resume received 15-Oct-2026 (self-reported). External corroboration pending (search backend unavailable). Referees on file: Fadhli Nor Azman (Head of Compliance, ShopeePay/SeaMoney MY), Suzanna Sulaiman (Head of Branch Audit, SME Bank).</w:t>
+        <w:t>B) Senior Advisor retainer, 2 days/wk — P1–P3 immediately; P4–P5 after transition; COI note required.</w:t>
       </w:r>
     </w:p>
     <w:sectPr>

</xml_diff>

<commit_message>
jd(head-fcc): v3 — translation-engine table (his bank skills -> crypto outputs), 30-day funded crypto ramp w/ T0 brief gate, clear-tasks standing backlog (10 named/cadenced), crypto-not-required hiring grammar per TRM/Elliptic study
</commit_message>
<xml_diff>
--- a/careers/JD-head-fcc.docx
+++ b/careers/JD-head-fcc.docx
@@ -7,24 +7,59 @@
         <w:pStyle w:val="Title"/>
       </w:pPr>
       <w:r>
-        <w:t>Head of Financial Crime Compliance — ChainSentry</w:t>
+        <w:rPr>
+          <w:color w:val="0B2D5C"/>
+        </w:rPr>
+        <w:t>JD — Head of Financial Crime Compliance, ChainSentry</w:t>
       </w:r>
     </w:p>
     <w:p>
       <w:r>
         <w:rPr>
-          <w:color w:val="555F6B"/>
+          <w:b/>
         </w:rPr>
-        <w:t>Aras Integrasi Sdn Bhd · v2 · 15-Oct-2026 · KL/hybrid · full-time or advisor retainer</w:t>
+        <w:t>Company:</w:t>
+      </w:r>
+      <w:r>
+        <w:t xml:space="preserve"> Aras Integrasi Sdn Bhd · </w:t>
+      </w:r>
+      <w:r>
+        <w:rPr>
+          <w:b/>
+        </w:rPr>
+        <w:t>Product:</w:t>
+      </w:r>
+      <w:r>
+        <w:t xml:space="preserve"> ChainSentry (blockchain forensics &amp; AML tracing, sovereign-deployable)</w:t>
       </w:r>
     </w:p>
     <w:p>
       <w:r>
         <w:rPr>
-          <w:i/>
-          <w:sz w:val="19"/>
+          <w:b/>
         </w:rPr>
-        <w:t>v2: crypto-competence ramp (T0 gate) + multi-jurisdiction scope + corridor design partners — engineered against live competitor hiring data (Elliptic/TRM, studied 15-Oct).</w:t>
+        <w:t>Reports to:</w:t>
+      </w:r>
+      <w:r>
+        <w:t xml:space="preserve"> Solutions Architect (COO track) · </w:t>
+      </w:r>
+      <w:r>
+        <w:rPr>
+          <w:b/>
+        </w:rPr>
+        <w:t>Location:</w:t>
+      </w:r>
+      <w:r>
+        <w:t xml:space="preserve"> KL · hybrid · </w:t>
+      </w:r>
+      <w:r>
+        <w:rPr>
+          <w:b/>
+        </w:rPr>
+        <w:t>Mode:</w:t>
+      </w:r>
+      <w:r>
+        <w:t xml:space="preserve"> full-time, or 2-day/wk advisor retainer</w:t>
       </w:r>
     </w:p>
     <w:p>
@@ -32,12 +67,16 @@
         <w:pStyle w:val="Heading1"/>
       </w:pPr>
       <w:r>
-        <w:t>Mission</w:t>
+        <w:rPr>
+          <w:color w:val="0B2D5C"/>
+          <w:sz w:val="26"/>
+        </w:rPr>
+        <w:t>Why this role exists</w:t>
       </w:r>
     </w:p>
     <w:p>
       <w:r>
-        <w:t>Make ChainSentry the blockchain-tracing product that a regulated institution — a Malaysian bank, DAX or FIU first, then any corridor jurisdiction (SG/TH/VN/ID/AE/TR/EG) — can defend choosing: to its board, to its regulator, and in court.</w:t>
+        <w:t>ChainSentry's binding constraint is trust, not engineering. This seat owns the trust side end-to-end: regulatory soundness, evidentiary strength, buyer credibility, and regulator presence across MY + the corridor.</w:t>
       </w:r>
     </w:p>
     <w:p>
@@ -45,14 +84,17 @@
         <w:pStyle w:val="Heading1"/>
       </w:pPr>
       <w:r>
-        <w:t>What he owns</w:t>
+        <w:rPr>
+          <w:color w:val="0B2D5C"/>
+          <w:sz w:val="26"/>
+        </w:rPr>
+        <w:t>The translation engine — his skills → crypto (how we utilize him)</w:t>
       </w:r>
     </w:p>
     <w:tbl>
       <w:tblPr>
         <w:tblStyle w:val="LightGrid-Accent1"/>
         <w:tblW w:type="auto" w:w="0"/>
-        <w:jc w:val="center"/>
         <w:tblLook w:firstColumn="1" w:firstRow="1" w:lastColumn="0" w:lastRow="0" w:noHBand="0" w:noVBand="1" w:val="04A0"/>
       </w:tblPr>
       <w:tblGrid>
@@ -69,8 +111,9 @@
             <w:r>
               <w:rPr>
                 <w:b/>
+                <w:sz w:val="17"/>
               </w:rPr>
-              <w:t>Pillar</w:t>
+              <w:t>His skill (bank-native)</w:t>
             </w:r>
           </w:p>
         </w:tc>
@@ -82,8 +125,9 @@
             <w:r>
               <w:rPr>
                 <w:b/>
+                <w:sz w:val="17"/>
               </w:rPr>
-              <w:t>Scope</w:t>
+              <w:t>How it lands in crypto</w:t>
             </w:r>
           </w:p>
         </w:tc>
@@ -95,8 +139,9 @@
             <w:r>
               <w:rPr>
                 <w:b/>
+                <w:sz w:val="17"/>
               </w:rPr>
-              <w:t>Authority</w:t>
+              <w:t>What he produces for ChainSentry</w:t>
             </w:r>
           </w:p>
         </w:tc>
@@ -109,9 +154,9 @@
           <w:p>
             <w:r>
               <w:rPr>
-                <w:sz w:val="18"/>
+                <w:sz w:val="17"/>
               </w:rPr>
-              <w:t>P1 Regulatory → product (multi-juris)</w:t>
+              <w:t>FIED STR drafting (PDRM/ASTANA)</w:t>
             </w:r>
           </w:p>
         </w:tc>
@@ -122,9 +167,9 @@
           <w:p>
             <w:r>
               <w:rPr>
-                <w:sz w:val="18"/>
+                <w:sz w:val="17"/>
               </w:rPr>
-              <w:t>MY beachhead: BNM AML/CFT, SC RM Guidelines 2025, PMABA, AMLATFPUAA. Corridor: FATF R.15/R.20+Travel Rule, MAS PSN01/02 (SG), VARA/AMLC (UAE), AMLO (TH), PPATK (ID), MiCA horizon. Standing horizon-scan practice.</w:t>
+              <w:t>STR anatomy is identical on-chain; only evidence artifacts change (txhash, cluster, exposure path)</w:t>
             </w:r>
           </w:p>
         </w:tc>
@@ -135,9 +180,9 @@
           <w:p>
             <w:r>
               <w:rPr>
-                <w:sz w:val="18"/>
+                <w:sz w:val="17"/>
               </w:rPr>
-              <w:t>Sets trust-backlog priorities</w:t>
+              <w:t>STR-ready case-file workflow; "crypto STR" playbook for Malaysian FIs — none exists publicly today</w:t>
             </w:r>
           </w:p>
         </w:tc>
@@ -150,9 +195,9 @@
           <w:p>
             <w:r>
               <w:rPr>
-                <w:sz w:val="18"/>
+                <w:sz w:val="17"/>
               </w:rPr>
-              <w:t>P2 Evidentiary standard</w:t>
+              <w:t>AMLATFPUAA 2001 disclosure orders</w:t>
             </w:r>
           </w:p>
         </w:tc>
@@ -163,9 +208,9 @@
           <w:p>
             <w:r>
               <w:rPr>
-                <w:sz w:val="18"/>
+                <w:sz w:val="17"/>
               </w:rPr>
-              <w:t>Chain-of-custody + court-grade export: TXID verification, STR field-mapping (FIED first, corridor FIUs next), order-response packs. Defines "good enough for the judge" incl. chain evidence.</w:t>
+              <w:t>On-chain records = digital evidence; admissibility questions are his, not ours</w:t>
             </w:r>
           </w:p>
         </w:tc>
@@ -176,9 +221,9 @@
           <w:p>
             <w:r>
               <w:rPr>
-                <w:sz w:val="18"/>
+                <w:sz w:val="17"/>
               </w:rPr>
-              <w:t>VETO on evidentiary claims</w:t>
+              <w:t>Evidentiary standard for export: chain-of-custody, exhibit naming, affidavit hooks</w:t>
             </w:r>
           </w:p>
         </w:tc>
@@ -191,9 +236,9 @@
           <w:p>
             <w:r>
               <w:rPr>
-                <w:sz w:val="18"/>
+                <w:sz w:val="17"/>
               </w:rPr>
-              <w:t>P3 Trust gatekeeper</w:t>
+              <w:t>Sanctions/name screening (Refinitiv/DJ/CTOS)</w:t>
             </w:r>
           </w:p>
         </w:tc>
@@ -204,9 +249,9 @@
           <w:p>
             <w:r>
               <w:rPr>
-                <w:sz w:val="18"/>
+                <w:sz w:val="17"/>
               </w:rPr>
-              <w:t>Every sales claim, deck, webinar reviewed per jurisdiction against product truth and lawful assertion.</w:t>
+              <w:t>OFAC SDN + virtual-asset designations + Travel Rule = screening with a wallet dimension</w:t>
             </w:r>
           </w:p>
         </w:tc>
@@ -217,9 +262,9 @@
           <w:p>
             <w:r>
               <w:rPr>
-                <w:sz w:val="18"/>
+                <w:sz w:val="17"/>
               </w:rPr>
-              <w:t>VETO on claims</w:t>
+              <w:t>Requirement set for our sanctions/VA-designation coverage; MEA lanes hinge on this</w:t>
             </w:r>
           </w:p>
         </w:tc>
@@ -232,9 +277,9 @@
           <w:p>
             <w:r>
               <w:rPr>
-                <w:sz w:val="18"/>
+                <w:sz w:val="17"/>
               </w:rPr>
-              <w:t>P4 Design partners (MY → corridor)</w:t>
+              <w:t>Regulatory inspection response (BNM/SC)</w:t>
             </w:r>
           </w:p>
         </w:tc>
@@ -245,9 +290,9 @@
           <w:p>
             <w:r>
               <w:rPr>
-                <w:sz w:val="18"/>
+                <w:sz w:val="17"/>
               </w:rPr>
-              <w:t>2–3 MY partners (T1 roster + his network), then 1–2 corridor (MEA roster 72 targets). Pilot-compliance playbook → named references. Network-activation mandate, no cold quota.</w:t>
+              <w:t>Regulators now ask FIs about VA exposure, DAX/KYT vendors, Travel Rule</w:t>
             </w:r>
           </w:p>
         </w:tc>
@@ -258,9 +303,9 @@
           <w:p>
             <w:r>
               <w:rPr>
-                <w:sz w:val="18"/>
+                <w:sz w:val="17"/>
               </w:rPr>
-              <w:t>Owns partner bar (w/ Aras sales)</w:t>
+              <w:t>Trust Requirements Spec; our answers to FI questionnaires</w:t>
             </w:r>
           </w:p>
         </w:tc>
@@ -273,9 +318,9 @@
           <w:p>
             <w:r>
               <w:rPr>
-                <w:sz w:val="18"/>
+                <w:sz w:val="17"/>
               </w:rPr>
-              <w:t>P5 Regulator &amp; industry (regional)</w:t>
+              <w:t>Board/management reporting</w:t>
             </w:r>
           </w:p>
         </w:tc>
@@ -286,9 +331,9 @@
           <w:p>
             <w:r>
               <w:rPr>
-                <w:sz w:val="18"/>
+                <w:sz w:val="17"/>
               </w:rPr>
-              <w:t>BNM/SC engagement as compliance peer; whitepaper multi-jurisdiction editions under his name; appearances beyond MY as corridor pilots engage.</w:t>
+              <w:t>Boards ask "how do we govern crypto risk" without vendor fog</w:t>
             </w:r>
           </w:p>
         </w:tc>
@@ -299,9 +344,91 @@
           <w:p>
             <w:r>
               <w:rPr>
-                <w:sz w:val="18"/>
+                <w:sz w:val="17"/>
               </w:rPr>
-              <w:t>ChainSentry compliance voice</w:t>
+              <w:t>Compliance-grade reporting pack: what a board needs, in board language</w:t>
+            </w:r>
+          </w:p>
+        </w:tc>
+      </w:tr>
+      <w:tr>
+        <w:tc>
+          <w:tcPr>
+            <w:tcW w:type="dxa" w:w="2880"/>
+          </w:tcPr>
+          <w:p>
+            <w:r>
+              <w:rPr>
+                <w:sz w:val="17"/>
+              </w:rPr>
+              <w:t>Court proceedings experience</w:t>
+            </w:r>
+          </w:p>
+        </w:tc>
+        <w:tc>
+          <w:tcPr>
+            <w:tcW w:type="dxa" w:w="2880"/>
+          </w:tcPr>
+          <w:p>
+            <w:r>
+              <w:rPr>
+                <w:sz w:val="17"/>
+              </w:rPr>
+              <w:t>First on-chain cases will be contested; expert testimony is scarce locally</w:t>
+            </w:r>
+          </w:p>
+        </w:tc>
+        <w:tc>
+          <w:tcPr>
+            <w:tcW w:type="dxa" w:w="2880"/>
+          </w:tcPr>
+          <w:p>
+            <w:r>
+              <w:rPr>
+                <w:sz w:val="17"/>
+              </w:rPr>
+              <w:t>Deck/webinar claims audit; expert-witness readiness path for ChainSentry</w:t>
+            </w:r>
+          </w:p>
+        </w:tc>
+      </w:tr>
+      <w:tr>
+        <w:tc>
+          <w:tcPr>
+            <w:tcW w:type="dxa" w:w="2880"/>
+          </w:tcPr>
+          <w:p>
+            <w:r>
+              <w:rPr>
+                <w:sz w:val="17"/>
+              </w:rPr>
+              <w:t>AML policy/program build</w:t>
+            </w:r>
+          </w:p>
+        </w:tc>
+        <w:tc>
+          <w:tcPr>
+            <w:tcW w:type="dxa" w:w="2880"/>
+          </w:tcPr>
+          <w:p>
+            <w:r>
+              <w:rPr>
+                <w:sz w:val="17"/>
+              </w:rPr>
+              <w:t>FIs must extend programs to VA exposure — that extension IS our use case</w:t>
+            </w:r>
+          </w:p>
+        </w:tc>
+        <w:tc>
+          <w:tcPr>
+            <w:tcW w:type="dxa" w:w="2880"/>
+          </w:tcPr>
+          <w:p>
+            <w:r>
+              <w:rPr>
+                <w:sz w:val="17"/>
+              </w:rPr>
+              <w:t>Productized checklist: "AML program update for VA exposure" (lead magnet + pilot scope)</w:t>
             </w:r>
           </w:p>
         </w:tc>
@@ -312,43 +439,25 @@
         <w:pStyle w:val="Heading1"/>
       </w:pPr>
       <w:r>
-        <w:t>Engineered success (timeboxed artifacts)</w:t>
+        <w:rPr>
+          <w:color w:val="0B2D5C"/>
+          <w:sz w:val="26"/>
+        </w:rPr>
+        <w:t>Honest positioning</w:t>
       </w:r>
     </w:p>
     <w:p>
-      <w:pPr>
-        <w:pStyle w:val="ListBullet"/>
-        <w:spacing w:after="80"/>
-      </w:pPr>
       <w:r>
-        <w:t>Day 0–30 — T0 Chain-fluency boot: trace 5 live cases; day-30 gate = briefs one VA off-ramp typology unscripted. T1 Trust Requirements Spec v1 (MY + first corridor jurisdiction) signed by COO. T2 claims audit of all collateral.</w:t>
+        <w:t xml:space="preserve">We hire for judgment and translate for medium. Chain-fluency is a mandatory 30-day ramp we fund; his compliance depth is the raw material the product needs. The design principle is deliberate: </w:t>
       </w:r>
-    </w:p>
-    <w:p>
-      <w:pPr>
-        <w:pStyle w:val="ListBullet"/>
-        <w:spacing w:after="80"/>
-      </w:pPr>
       <w:r>
-        <w:t>Day 31–90 — T3 STR-ready case-file workflow (FIED mapping + AMLATFPUAA §28 pack) incl. crypto templates: exchange off-ramp, mixer-touch, mule fan-out. T4 two MY design-partner workshops, ≥3 engaged; first corridor partner opened.</w:t>
+        <w:rPr>
+          <w:b/>
+        </w:rPr>
+        <w:t>he is not our crypto expert — he is our crypto BUYER.</w:t>
       </w:r>
-    </w:p>
-    <w:p>
-      <w:pPr>
-        <w:pStyle w:val="ListBullet"/>
-        <w:spacing w:after="80"/>
-      </w:pPr>
       <w:r>
-        <w:t>Month 4–12 — 2 MY pilots w/ named-reference rights + ≥1 corridor pilot. Whitepaper (MY v1 + corridor supplement). ≥2 stage appearances (≥1 outside MY). ≥1 documented BNM/SC engagement.</w:t>
-      </w:r>
-    </w:p>
-    <w:p>
-      <w:pPr>
-        <w:pStyle w:val="ListBullet"/>
-        <w:spacing w:after="80"/>
-      </w:pPr>
-      <w:r>
-        <w:t>Terminal metric — a procurement checklist item where ChainSentry answers a regulator question better than the incumbent foreign suite — and the same answer travels to the next jurisdiction.</w:t>
+        <w:t xml:space="preserve"> The compliance head with no chain depth is exactly who ChainSentry must convert; his learning curve is the buyer's learning curve, and every step that teaches him ships as product capability.</w:t>
       </w:r>
     </w:p>
     <w:p>
@@ -356,12 +465,66 @@
         <w:pStyle w:val="Heading1"/>
       </w:pPr>
       <w:r>
-        <w:t>Crypto question, answered honestly</w:t>
+        <w:rPr>
+          <w:color w:val="0B2D5C"/>
+          <w:sz w:val="26"/>
+        </w:rPr>
+        <w:t>The crypto ramp — first 30 days (part of the job, not homework)</w:t>
       </w:r>
     </w:p>
     <w:p>
       <w:r>
-        <w:t>His resume shows zero crypto/VA exposure — stated, not hidden. Category norm: Elliptic requires only "working knowledge of crypto and blockchain" for its trust/advisory seats; chain depth lives in a separate investigator bench (ours = engineering + intelligence lane). The JD engineers closure via the T0 gate with a hard day-30 test. His transferables are what buyers test on: sanctions screening (UN/OFAC/MOHA), STR craft, order response, court testimony.</w:t>
+        <w:rPr>
+          <w:b/>
+        </w:rPr>
+        <w:t>Week 1 — Mental model.</w:t>
+      </w:r>
+      <w:r>
+        <w:t xml:space="preserve"> Addresses, blocks, fees; UTXO vs account; what a wallet is and isn't; exchanges, DEXs, mixers, bridges; block explorers without fear. 2×2h engineering-led sessions + reading.</w:t>
+      </w:r>
+    </w:p>
+    <w:p>
+      <w:r>
+        <w:rPr>
+          <w:b/>
+        </w:rPr>
+        <w:t>Week 2 — Typologies in his native language.</w:t>
+      </w:r>
+      <w:r>
+        <w:t xml:space="preserve"> Pig-butchering, romance scams, mule networks, ransomware, sanctioned-entity movement, off-ramp patterns — each mapped to the typology he already knows: mule accounts ↔ mule wallets, cash-out ↔ off-ramp, layering ↔ chain-hop. He writes each mapping as a one-pager; the one-pagers become our MY-tuned typology library.</w:t>
+      </w:r>
+    </w:p>
+    <w:p>
+      <w:r>
+        <w:rPr>
+          <w:b/>
+        </w:rPr>
+        <w:t>Week 3 — Tool-side.</w:t>
+      </w:r>
+      <w:r>
+        <w:t xml:space="preserve"> ChainSentry hands-on: run 5 seeded live cases end-to-end; tag/cluster/exposure features; every place the tool fails to answer a compliance question becomes a backlog entry with his name on it.</w:t>
+      </w:r>
+    </w:p>
+    <w:p>
+      <w:r>
+        <w:rPr>
+          <w:b/>
+        </w:rPr>
+        <w:t>Week 4 — His turn (T0 gate, contractual).</w:t>
+      </w:r>
+      <w:r>
+        <w:t xml:space="preserve"> Unscripted 20-min brief: one VA off-ramp typology, to the product team, in compliance language. Pass = the team understood it without translation.</w:t>
+      </w:r>
+    </w:p>
+    <w:p>
+      <w:r>
+        <w:rPr>
+          <w:b/>
+        </w:rPr>
+        <w:t>Ongoing.</w:t>
+      </w:r>
+      <w:r>
+        <w:t xml:space="preserve"> One chain-fluency item/week (TRM/Elliptic/Chainalysis public reports, FATF VA updates, SC RM Guidelines); budgeted path to recognisable standing (CAMS-Crypto or equivalent).</w:t>
       </w:r>
     </w:p>
     <w:p>
@@ -369,17 +532,458 @@
         <w:pStyle w:val="Heading1"/>
       </w:pPr>
       <w:r>
-        <w:t>Engagement</w:t>
+        <w:rPr>
+          <w:color w:val="0B2D5C"/>
+          <w:sz w:val="26"/>
+        </w:rPr>
+        <w:t>Success artifacts (engineered in — dated, checkable)</w:t>
       </w:r>
     </w:p>
     <w:p>
       <w:r>
-        <w:t>A) Full-time — when off current employment; band indicative RM15–20k/mo + KPI bonus (owner to confirm).</w:t>
+        <w:rPr>
+          <w:b/>
+        </w:rPr>
+        <w:t>T0 (Day 30):</w:t>
+      </w:r>
+      <w:r>
+        <w:t xml:space="preserve"> passes the Week-4 crypto brief (above) + his 4 typology one-pagers merged into the product's typology library.</w:t>
       </w:r>
     </w:p>
     <w:p>
       <w:r>
-        <w:t>B) Senior Advisor retainer, 2 days/wk — P1–P3 immediately; P4–P5 after transition; COI note required.</w:t>
+        <w:rPr>
+          <w:b/>
+        </w:rPr>
+        <w:t>T1 (Day 30):</w:t>
+      </w:r>
+      <w:r>
+        <w:t xml:space="preserve"> Trust Requirements Spec — what MY + 2 corridor jurisdictions require of a forensic tool, signed by us as backlog commitments.</w:t>
+      </w:r>
+    </w:p>
+    <w:p>
+      <w:r>
+        <w:rPr>
+          <w:b/>
+        </w:rPr>
+        <w:t>T2 (Day 60):</w:t>
+      </w:r>
+      <w:r>
+        <w:t xml:space="preserve"> STR-ready case-file workflow defined from his FIED experience; engineering accepts scope.</w:t>
+      </w:r>
+    </w:p>
+    <w:p>
+      <w:r>
+        <w:rPr>
+          <w:b/>
+        </w:rPr>
+        <w:t>T3 (Day 90):</w:t>
+      </w:r>
+      <w:r>
+        <w:t xml:space="preserve"> 2–3 MY design partners engaged; crypto-STR playbook v1 draft; all collateral claims-audited once.</w:t>
+      </w:r>
+    </w:p>
+    <w:p>
+      <w:r>
+        <w:rPr>
+          <w:b/>
+        </w:rPr>
+        <w:t>T4 (Month 12):</w:t>
+      </w:r>
+      <w:r>
+        <w:t xml:space="preserve"> 2 named-reference pilots; methodology whitepaper (MY + corridor supplement); ≥1 appearance outside MY; ≥1 documented BNM/SC engagement.</w:t>
+      </w:r>
+    </w:p>
+    <w:p>
+      <w:pPr>
+        <w:pStyle w:val="Heading1"/>
+      </w:pPr>
+      <w:r>
+        <w:rPr>
+          <w:color w:val="0B2D5C"/>
+          <w:sz w:val="26"/>
+        </w:rPr>
+        <w:t>Clear tasks — his standing backlog, from week one</w:t>
+      </w:r>
+    </w:p>
+    <w:p>
+      <w:r>
+        <w:t>Named, checkable, no grey zones. Standing cadence unless noted:</w:t>
+      </w:r>
+    </w:p>
+    <w:p>
+      <w:pPr>
+        <w:pStyle w:val="ListNumber"/>
+      </w:pPr>
+      <w:r>
+        <w:rPr>
+          <w:b/>
+        </w:rPr>
+        <w:t>Weekly:</w:t>
+      </w:r>
+      <w:r>
+        <w:t xml:space="preserve"> claims-audit pass on any new/changed collateral or deck (veto authority); review open case studies against evidentiary standard.</w:t>
+      </w:r>
+    </w:p>
+    <w:p>
+      <w:pPr>
+        <w:pStyle w:val="ListNumber"/>
+      </w:pPr>
+      <w:r>
+        <w:rPr>
+          <w:b/>
+        </w:rPr>
+        <w:t>Weekly (from wk 3):</w:t>
+      </w:r>
+      <w:r>
+        <w:t xml:space="preserve"> "tool vs compliance question" log — every question the product cannot answer becomes a backlog entry; he owns the log.</w:t>
+      </w:r>
+    </w:p>
+    <w:p>
+      <w:pPr>
+        <w:pStyle w:val="ListNumber"/>
+      </w:pPr>
+      <w:r>
+        <w:rPr>
+          <w:b/>
+        </w:rPr>
+        <w:t>Day 1–10:</w:t>
+      </w:r>
+      <w:r>
+        <w:t xml:space="preserve"> interviews — our 66-contact roster + his own network: minimum 8 conversations on how FIs handle VA exposure today. Output: Trust Requirements Spec input set.</w:t>
+      </w:r>
+    </w:p>
+    <w:p>
+      <w:pPr>
+        <w:pStyle w:val="ListNumber"/>
+      </w:pPr>
+      <w:r>
+        <w:rPr>
+          <w:b/>
+        </w:rPr>
+        <w:t>Day 1–30:</w:t>
+      </w:r>
+      <w:r>
+        <w:t xml:space="preserve"> write 4 typology one-pagers (his mapping work — Week 2 ramp); own T0 brief.</w:t>
+      </w:r>
+    </w:p>
+    <w:p>
+      <w:pPr>
+        <w:pStyle w:val="ListNumber"/>
+      </w:pPr>
+      <w:r>
+        <w:rPr>
+          <w:b/>
+        </w:rPr>
+        <w:t>Day 30–60:</w:t>
+      </w:r>
+      <w:r>
+        <w:t xml:space="preserve"> STR-ready case-file workflow — write it, walk it with engineering, walk it with one friendly MLRO (candidate: his referee, conflict-cleared first).</w:t>
+      </w:r>
+    </w:p>
+    <w:p>
+      <w:pPr>
+        <w:pStyle w:val="ListNumber"/>
+      </w:pPr>
+      <w:r>
+        <w:rPr>
+          <w:b/>
+        </w:rPr>
+        <w:t>Day 30–90:</w:t>
+      </w:r>
+      <w:r>
+        <w:t xml:space="preserve"> design-partner recruitment — target list from our T1 roster + his book; he leads, COO shadows.</w:t>
+      </w:r>
+    </w:p>
+    <w:p>
+      <w:pPr>
+        <w:pStyle w:val="ListNumber"/>
+      </w:pPr>
+      <w:r>
+        <w:rPr>
+          <w:b/>
+        </w:rPr>
+        <w:t>Monthly:</w:t>
+      </w:r>
+      <w:r>
+        <w:t xml:space="preserve"> horizon scan — one page, corridor regulatory movement (MAS, VARA, PPATK, AMLO, SC/BNM, FATF), with "so what for ChainSentry" line per item.</w:t>
+      </w:r>
+    </w:p>
+    <w:p>
+      <w:pPr>
+        <w:pStyle w:val="ListNumber"/>
+      </w:pPr>
+      <w:r>
+        <w:rPr>
+          <w:b/>
+        </w:rPr>
+        <w:t>Quarterly:</w:t>
+      </w:r>
+      <w:r>
+        <w:t xml:space="preserve"> webinar/briefing under his name (MY, then corridor); conference circuit proposal to COO.</w:t>
+      </w:r>
+    </w:p>
+    <w:p>
+      <w:pPr>
+        <w:pStyle w:val="ListNumber"/>
+      </w:pPr>
+      <w:r>
+        <w:rPr>
+          <w:b/>
+        </w:rPr>
+        <w:t>Quarterly:</w:t>
+      </w:r>
+      <w:r>
+        <w:t xml:space="preserve"> expert-network activation — join 1–2 (Deloitte/FTI/Ropes&amp;Gray class), log any ChainSentry referral as engagement, never quota.</w:t>
+      </w:r>
+    </w:p>
+    <w:p>
+      <w:pPr>
+        <w:pStyle w:val="ListNumber"/>
+      </w:pPr>
+      <w:r>
+        <w:rPr>
+          <w:b/>
+        </w:rPr>
+        <w:t>Standing:</w:t>
+      </w:r>
+      <w:r>
+        <w:t xml:space="preserve"> veto on public claims about evidentiary/regulatory matters. If he can't say it at a BNM roundtable, it doesn't ship.</w:t>
+      </w:r>
+    </w:p>
+    <w:p>
+      <w:pPr>
+        <w:pStyle w:val="Heading1"/>
+      </w:pPr>
+      <w:r>
+        <w:rPr>
+          <w:color w:val="0B2D5C"/>
+          <w:sz w:val="26"/>
+        </w:rPr>
+        <w:t>Pillars (what he owns)</w:t>
+      </w:r>
+    </w:p>
+    <w:p>
+      <w:pPr>
+        <w:pStyle w:val="ListBullet"/>
+      </w:pPr>
+      <w:r>
+        <w:rPr>
+          <w:b/>
+        </w:rPr>
+        <w:t>P1 Regulatory soundness — MY + corridor.</w:t>
+      </w:r>
+      <w:r>
+        <w:t xml:space="preserve"> BNM/SC/PMABA/AMLATFPUAA at home; FATF R.15/R.20 + Travel Rule, MAS PSN01/02 (SG), VARA/AMLC (UAE), AMLO (TH), PPATK (ID), MiCA horizon. He converts regimes → requirement rows in our backlog.</w:t>
+      </w:r>
+    </w:p>
+    <w:p>
+      <w:pPr>
+        <w:pStyle w:val="ListBullet"/>
+      </w:pPr>
+      <w:r>
+        <w:rPr>
+          <w:b/>
+        </w:rPr>
+        <w:t>P2 Evidentiary standard.</w:t>
+      </w:r>
+      <w:r>
+        <w:t xml:space="preserve"> Owns what "court-grade export" means; </w:t>
+      </w:r>
+      <w:r>
+        <w:rPr>
+          <w:b/>
+        </w:rPr>
+        <w:t>veto</w:t>
+      </w:r>
+      <w:r>
+        <w:t xml:space="preserve"> on evidentiary claims. On-chain evidence is a new medium; admissibility law is his old law.</w:t>
+      </w:r>
+    </w:p>
+    <w:p>
+      <w:pPr>
+        <w:pStyle w:val="ListBullet"/>
+      </w:pPr>
+      <w:r>
+        <w:rPr>
+          <w:b/>
+        </w:rPr>
+        <w:t>P3 Trust gatekeeper.</w:t>
+      </w:r>
+      <w:r>
+        <w:t xml:space="preserve"> </w:t>
+      </w:r>
+      <w:r>
+        <w:rPr>
+          <w:b/>
+        </w:rPr>
+        <w:t>Veto</w:t>
+      </w:r>
+      <w:r>
+        <w:t xml:space="preserve"> on sales claims/decks/webinars. Crypto buyers are the most claim-sensitive segment on earth — one overstated "we traced it" burns a corridor deal.</w:t>
+      </w:r>
+    </w:p>
+    <w:p>
+      <w:pPr>
+        <w:pStyle w:val="ListBullet"/>
+      </w:pPr>
+      <w:r>
+        <w:rPr>
+          <w:b/>
+        </w:rPr>
+        <w:t>P4 Design partners &amp; references.</w:t>
+      </w:r>
+      <w:r>
+        <w:t xml:space="preserve"> MY first, then corridor — network activation, not cold outreach.</w:t>
+      </w:r>
+    </w:p>
+    <w:p>
+      <w:pPr>
+        <w:pStyle w:val="ListBullet"/>
+      </w:pPr>
+      <w:r>
+        <w:rPr>
+          <w:b/>
+        </w:rPr>
+        <w:t>P5 Regulator &amp; market presence.</w:t>
+      </w:r>
+      <w:r>
+        <w:t xml:space="preserve"> Whitepaper in his name, BNM/SC engagement as compliance peer, corridor conference circuit by month 12.</w:t>
+      </w:r>
+    </w:p>
+    <w:p>
+      <w:pPr>
+        <w:pStyle w:val="Heading1"/>
+      </w:pPr>
+      <w:r>
+        <w:rPr>
+          <w:color w:val="0B2D5C"/>
+          <w:sz w:val="26"/>
+        </w:rPr>
+        <w:t>Who we're looking for</w:t>
+      </w:r>
+    </w:p>
+    <w:p>
+      <w:pPr>
+        <w:pStyle w:val="ListBullet"/>
+      </w:pPr>
+      <w:r>
+        <w:t>8+ yrs AML/financial-crime in banking/FI (MY or corridor): STR author, FIU-facing, regulator engagement, program builds.</w:t>
+      </w:r>
+    </w:p>
+    <w:p>
+      <w:pPr>
+        <w:pStyle w:val="ListBullet"/>
+      </w:pPr>
+      <w:r>
+        <w:t>Sanctions &amp; screening tooling depth; board-level reporting.</w:t>
+      </w:r>
+    </w:p>
+    <w:p>
+      <w:pPr>
+        <w:pStyle w:val="ListBullet"/>
+      </w:pPr>
+      <w:r>
+        <w:rPr>
+          <w:b/>
+        </w:rPr>
+        <w:t>Crypto: not required.</w:t>
+      </w:r>
+      <w:r>
+        <w:t xml:space="preserve"> Curiosity + completing the funded 30-day ramp is. CAMS a plus; any VA exposure a bonus, never a gate.</w:t>
+      </w:r>
+    </w:p>
+    <w:p>
+      <w:pPr>
+        <w:pStyle w:val="ListBullet"/>
+      </w:pPr>
+      <w:r>
+        <w:t>Can brief a room of MLROs without vendor fog. Writes well. Standing in the MY/corridor compliance community.</w:t>
+      </w:r>
+    </w:p>
+    <w:p>
+      <w:pPr>
+        <w:pStyle w:val="Heading1"/>
+      </w:pPr>
+      <w:r>
+        <w:rPr>
+          <w:color w:val="0B2D5C"/>
+          <w:sz w:val="26"/>
+        </w:rPr>
+        <w:t>What we give him</w:t>
+      </w:r>
+    </w:p>
+    <w:p>
+      <w:r>
+        <w:t xml:space="preserve">Crypto education funded and scheduled · sandbox + live cases week 1 · direct engineering access, backlog honored · warm T1 doors opened by COO · his name on the whitepaper · conference budget · </w:t>
+      </w:r>
+      <w:r>
+        <w:rPr>
+          <w:b/>
+        </w:rPr>
+        <w:t>no year-1 sales quota</w:t>
+      </w:r>
+      <w:r>
+        <w:t xml:space="preserve"> (category norm; TRM's own words: "activate a network you've already earned… not a traditional closing-quota sales role") · builder equity story.</w:t>
+      </w:r>
+    </w:p>
+    <w:p>
+      <w:pPr>
+        <w:pStyle w:val="Heading1"/>
+      </w:pPr>
+      <w:r>
+        <w:rPr>
+          <w:color w:val="0B2D5C"/>
+          <w:sz w:val="26"/>
+        </w:rPr>
+        <w:t>Guardrails</w:t>
+      </w:r>
+    </w:p>
+    <w:p>
+      <w:r>
+        <w:t>No solicitation of current employer while employed (corridor via formal channels only) · independence: no side retainers that conflict with the veto seat · no commission pressure on trust functions · all his third-party-facing comms run the claims-audit workflow (self-audit, COO sign-off).</w:t>
+      </w:r>
+    </w:p>
+    <w:p>
+      <w:pPr>
+        <w:pStyle w:val="Heading1"/>
+      </w:pPr>
+      <w:r>
+        <w:rPr>
+          <w:color w:val="0B2D5C"/>
+          <w:sz w:val="26"/>
+        </w:rPr>
+        <w:t>Engagement modes</w:t>
+      </w:r>
+    </w:p>
+    <w:p>
+      <w:r>
+        <w:rPr>
+          <w:b/>
+        </w:rPr>
+        <w:t>A. Full-time head</w:t>
+      </w:r>
+      <w:r>
+        <w:t xml:space="preserve"> — all five pillars, T0–T4 as contract objectives. </w:t>
+      </w:r>
+      <w:r>
+        <w:rPr>
+          <w:b/>
+        </w:rPr>
+        <w:t>B. Advisor retainer (2 days/wk)</w:t>
+      </w:r>
+      <w:r>
+        <w:t xml:space="preserve"> — P1–P3 immediately, ramp compressed to days 1–14, P4/P5 deferred to hire #2; COI-clean pattern for an in-market senior.</w:t>
+      </w:r>
+    </w:p>
+    <w:p>
+      <w:r>
+        <w:rPr>
+          <w:i/>
+          <w:color w:val="555F6B"/>
+          <w:sz w:val="18"/>
+        </w:rPr>
+        <w:t>Band: indicative RM15–20k/mo (A); pro-rated (B). Owner confirmation before posting.</w:t>
       </w:r>
     </w:p>
     <w:sectPr>

</xml_diff>